<commit_message>
Addded SQL datbase script word document
</commit_message>
<xml_diff>
--- a/docs/APIEndpointPlan.docx
+++ b/docs/APIEndpointPlan.docx
@@ -159,21 +159,7 @@
         <w:rPr>
           <w:lang w:val="en-US"/>
         </w:rPr>
-        <w:t xml:space="preserve">The POE requires each endpoint to specify the </w:t>
-      </w:r>
-      <w:proofErr w:type="gramStart"/>
-      <w:r>
-        <w:rPr>
-          <w:lang w:val="en-US"/>
-        </w:rPr>
-        <w:t>HTT{ method</w:t>
-      </w:r>
-      <w:proofErr w:type="gramEnd"/>
-      <w:r>
-        <w:rPr>
-          <w:lang w:val="en-US"/>
-        </w:rPr>
-        <w:t>, route, description, required role, request body and expected response</w:t>
+        <w:t>The POE requires each endpoint to specify the HTT{ method, route, description, required role, request body and expected response</w:t>
       </w:r>
     </w:p>
     <w:p>
@@ -372,15 +358,7 @@
               </w:rPr>
             </w:pPr>
             <w:r>
-              <w:t>/</w:t>
-            </w:r>
-            <w:proofErr w:type="spellStart"/>
-            <w:r>
-              <w:t>api</w:t>
-            </w:r>
-            <w:proofErr w:type="spellEnd"/>
-            <w:r>
-              <w:t>/events</w:t>
+              <w:t>/api/events</w:t>
             </w:r>
           </w:p>
         </w:tc>
@@ -399,21 +377,7 @@
               <w:rPr>
                 <w:lang w:val="en-US"/>
               </w:rPr>
-              <w:t xml:space="preserve">Returns upcoming </w:t>
-            </w:r>
-            <w:proofErr w:type="spellStart"/>
-            <w:r>
-              <w:rPr>
-                <w:lang w:val="en-US"/>
-              </w:rPr>
-              <w:t>RaceDay</w:t>
-            </w:r>
-            <w:proofErr w:type="spellEnd"/>
-            <w:r>
-              <w:rPr>
-                <w:lang w:val="en-US"/>
-              </w:rPr>
-              <w:t xml:space="preserve"> events.</w:t>
+              <w:t>Returns upcoming RaceDay events.</w:t>
             </w:r>
           </w:p>
         </w:tc>
@@ -498,15 +462,7 @@
               </w:rPr>
             </w:pPr>
             <w:r>
-              <w:t>/</w:t>
-            </w:r>
-            <w:proofErr w:type="spellStart"/>
-            <w:r>
-              <w:t>api</w:t>
-            </w:r>
-            <w:proofErr w:type="spellEnd"/>
-            <w:r>
-              <w:t>/events/{id}</w:t>
+              <w:t>/api/events/{id}</w:t>
             </w:r>
           </w:p>
         </w:tc>
@@ -619,15 +575,7 @@
               </w:rPr>
             </w:pPr>
             <w:r>
-              <w:t>/</w:t>
-            </w:r>
-            <w:proofErr w:type="spellStart"/>
-            <w:r>
-              <w:t>api</w:t>
-            </w:r>
-            <w:proofErr w:type="spellEnd"/>
-            <w:r>
-              <w:t>/events</w:t>
+              <w:t>/api/events</w:t>
             </w:r>
           </w:p>
         </w:tc>
@@ -674,50 +622,8 @@
                 <w:lang w:val="en-US"/>
               </w:rPr>
             </w:pPr>
-            <w:proofErr w:type="gramStart"/>
-            <w:r>
-              <w:t xml:space="preserve">{ </w:t>
-            </w:r>
-            <w:proofErr w:type="spellStart"/>
-            <w:r>
-              <w:t>eventName</w:t>
-            </w:r>
-            <w:proofErr w:type="spellEnd"/>
-            <w:proofErr w:type="gramEnd"/>
-            <w:r>
-              <w:t xml:space="preserve">, description, </w:t>
-            </w:r>
-            <w:proofErr w:type="spellStart"/>
-            <w:r>
-              <w:t>eventDate</w:t>
-            </w:r>
-            <w:proofErr w:type="spellEnd"/>
-            <w:r>
-              <w:t xml:space="preserve">, location, </w:t>
-            </w:r>
-            <w:proofErr w:type="spellStart"/>
-            <w:r>
-              <w:t>distanceKm</w:t>
-            </w:r>
-            <w:proofErr w:type="spellEnd"/>
-            <w:r>
-              <w:t xml:space="preserve">, </w:t>
-            </w:r>
-            <w:proofErr w:type="spellStart"/>
-            <w:r>
-              <w:t>eventType</w:t>
-            </w:r>
-            <w:proofErr w:type="spellEnd"/>
-            <w:r>
-              <w:t xml:space="preserve">, </w:t>
-            </w:r>
-            <w:proofErr w:type="spellStart"/>
-            <w:r>
-              <w:t>bannerImageUrl</w:t>
-            </w:r>
-            <w:proofErr w:type="spellEnd"/>
-            <w:r>
-              <w:t xml:space="preserve"> }</w:t>
+            <w:r>
+              <w:t>{ eventName, description, eventDate, location, distanceKm, eventType, bannerImageUrl }</w:t>
             </w:r>
           </w:p>
         </w:tc>
@@ -767,15 +673,7 @@
               </w:rPr>
             </w:pPr>
             <w:r>
-              <w:t>/</w:t>
-            </w:r>
-            <w:proofErr w:type="spellStart"/>
-            <w:r>
-              <w:t>api</w:t>
-            </w:r>
-            <w:proofErr w:type="spellEnd"/>
-            <w:r>
-              <w:t>/events/{id}</w:t>
+              <w:t>/api/events/{id}</w:t>
             </w:r>
           </w:p>
         </w:tc>
@@ -825,50 +723,8 @@
                 <w:lang w:val="en-US"/>
               </w:rPr>
             </w:pPr>
-            <w:proofErr w:type="gramStart"/>
-            <w:r>
-              <w:t xml:space="preserve">{ </w:t>
-            </w:r>
-            <w:proofErr w:type="spellStart"/>
-            <w:r>
-              <w:t>eventName</w:t>
-            </w:r>
-            <w:proofErr w:type="spellEnd"/>
-            <w:proofErr w:type="gramEnd"/>
-            <w:r>
-              <w:t xml:space="preserve">, description, </w:t>
-            </w:r>
-            <w:proofErr w:type="spellStart"/>
-            <w:r>
-              <w:t>eventDate</w:t>
-            </w:r>
-            <w:proofErr w:type="spellEnd"/>
-            <w:r>
-              <w:t xml:space="preserve">, location, </w:t>
-            </w:r>
-            <w:proofErr w:type="spellStart"/>
-            <w:r>
-              <w:t>distanceKm</w:t>
-            </w:r>
-            <w:proofErr w:type="spellEnd"/>
-            <w:r>
-              <w:t xml:space="preserve">, </w:t>
-            </w:r>
-            <w:proofErr w:type="spellStart"/>
-            <w:r>
-              <w:t>eventType</w:t>
-            </w:r>
-            <w:proofErr w:type="spellEnd"/>
-            <w:r>
-              <w:t xml:space="preserve">, </w:t>
-            </w:r>
-            <w:proofErr w:type="spellStart"/>
-            <w:r>
-              <w:t>bannerImageUrl</w:t>
-            </w:r>
-            <w:proofErr w:type="spellEnd"/>
-            <w:r>
-              <w:t xml:space="preserve"> }</w:t>
+            <w:r>
+              <w:t>{ eventName, description, eventDate, location, distanceKm, eventType, bannerImageUrl }</w:t>
             </w:r>
           </w:p>
         </w:tc>
@@ -918,15 +774,7 @@
               </w:rPr>
             </w:pPr>
             <w:r>
-              <w:t>/</w:t>
-            </w:r>
-            <w:proofErr w:type="spellStart"/>
-            <w:r>
-              <w:t>api</w:t>
-            </w:r>
-            <w:proofErr w:type="spellEnd"/>
-            <w:r>
-              <w:t>/events/{id}</w:t>
+              <w:t>/api/events/{id}</w:t>
             </w:r>
           </w:p>
         </w:tc>
@@ -1180,15 +1028,7 @@
               </w:rPr>
             </w:pPr>
             <w:r>
-              <w:t>/</w:t>
-            </w:r>
-            <w:proofErr w:type="spellStart"/>
-            <w:r>
-              <w:t>api</w:t>
-            </w:r>
-            <w:proofErr w:type="spellEnd"/>
-            <w:r>
-              <w:t>/profile</w:t>
+              <w:t>/api/profile</w:t>
             </w:r>
           </w:p>
         </w:tc>
@@ -1286,15 +1126,7 @@
               </w:rPr>
             </w:pPr>
             <w:r>
-              <w:t>/</w:t>
-            </w:r>
-            <w:proofErr w:type="spellStart"/>
-            <w:r>
-              <w:t>api</w:t>
-            </w:r>
-            <w:proofErr w:type="spellEnd"/>
-            <w:r>
-              <w:t>/profile</w:t>
+              <w:t>/api/profile</w:t>
             </w:r>
           </w:p>
         </w:tc>
@@ -1341,50 +1173,8 @@
                 <w:lang w:val="en-US"/>
               </w:rPr>
             </w:pPr>
-            <w:proofErr w:type="gramStart"/>
-            <w:r>
-              <w:t xml:space="preserve">{ </w:t>
-            </w:r>
-            <w:proofErr w:type="spellStart"/>
-            <w:r>
-              <w:t>firstName</w:t>
-            </w:r>
-            <w:proofErr w:type="spellEnd"/>
-            <w:proofErr w:type="gramEnd"/>
-            <w:r>
-              <w:t xml:space="preserve">, </w:t>
-            </w:r>
-            <w:proofErr w:type="spellStart"/>
-            <w:r>
-              <w:t>lastName</w:t>
-            </w:r>
-            <w:proofErr w:type="spellEnd"/>
-            <w:r>
-              <w:t xml:space="preserve">, </w:t>
-            </w:r>
-            <w:proofErr w:type="spellStart"/>
-            <w:r>
-              <w:t>phoneNumber</w:t>
-            </w:r>
-            <w:proofErr w:type="spellEnd"/>
-            <w:r>
-              <w:t xml:space="preserve">, </w:t>
-            </w:r>
-            <w:proofErr w:type="spellStart"/>
-            <w:r>
-              <w:t>dateOfBirth</w:t>
-            </w:r>
-            <w:proofErr w:type="spellEnd"/>
-            <w:r>
-              <w:t xml:space="preserve">, </w:t>
-            </w:r>
-            <w:proofErr w:type="spellStart"/>
-            <w:r>
-              <w:t>profilePictureUrl</w:t>
-            </w:r>
-            <w:proofErr w:type="spellEnd"/>
-            <w:r>
-              <w:t xml:space="preserve"> }</w:t>
+            <w:r>
+              <w:t>{ firstName, lastName, phoneNumber, dateOfBirth, profilePictureUrl }</w:t>
             </w:r>
           </w:p>
         </w:tc>
@@ -1618,15 +1408,7 @@
               </w:rPr>
             </w:pPr>
             <w:r>
-              <w:t>/</w:t>
-            </w:r>
-            <w:proofErr w:type="spellStart"/>
-            <w:r>
-              <w:t>api</w:t>
-            </w:r>
-            <w:proofErr w:type="spellEnd"/>
-            <w:r>
-              <w:t>/events</w:t>
+              <w:t>/api/events</w:t>
             </w:r>
           </w:p>
         </w:tc>
@@ -1642,15 +1424,7 @@
               </w:rPr>
             </w:pPr>
             <w:r>
-              <w:t xml:space="preserve">Returns upcoming </w:t>
-            </w:r>
-            <w:proofErr w:type="spellStart"/>
-            <w:r>
-              <w:t>RaceDay</w:t>
-            </w:r>
-            <w:proofErr w:type="spellEnd"/>
-            <w:r>
-              <w:t xml:space="preserve"> events.</w:t>
+              <w:t>Returns upcoming RaceDay events.</w:t>
             </w:r>
           </w:p>
         </w:tc>
@@ -1732,15 +1506,7 @@
               </w:rPr>
             </w:pPr>
             <w:r>
-              <w:t>/</w:t>
-            </w:r>
-            <w:proofErr w:type="spellStart"/>
-            <w:r>
-              <w:t>api</w:t>
-            </w:r>
-            <w:proofErr w:type="spellEnd"/>
-            <w:r>
-              <w:t>/events/{id}</w:t>
+              <w:t>/api/events/{id}</w:t>
             </w:r>
           </w:p>
         </w:tc>
@@ -1836,15 +1602,7 @@
               </w:rPr>
             </w:pPr>
             <w:r>
-              <w:t>/</w:t>
-            </w:r>
-            <w:proofErr w:type="spellStart"/>
-            <w:r>
-              <w:t>api</w:t>
-            </w:r>
-            <w:proofErr w:type="spellEnd"/>
-            <w:r>
-              <w:t>/events</w:t>
+              <w:t>/api/events</w:t>
             </w:r>
           </w:p>
         </w:tc>
@@ -1891,50 +1649,8 @@
                 <w:lang w:val="en-US"/>
               </w:rPr>
             </w:pPr>
-            <w:proofErr w:type="gramStart"/>
-            <w:r>
-              <w:t xml:space="preserve">{ </w:t>
-            </w:r>
-            <w:proofErr w:type="spellStart"/>
-            <w:r>
-              <w:t>eventName</w:t>
-            </w:r>
-            <w:proofErr w:type="spellEnd"/>
-            <w:proofErr w:type="gramEnd"/>
-            <w:r>
-              <w:t xml:space="preserve">, description, </w:t>
-            </w:r>
-            <w:proofErr w:type="spellStart"/>
-            <w:r>
-              <w:t>eventDate</w:t>
-            </w:r>
-            <w:proofErr w:type="spellEnd"/>
-            <w:r>
-              <w:t xml:space="preserve">, location, </w:t>
-            </w:r>
-            <w:proofErr w:type="spellStart"/>
-            <w:r>
-              <w:t>distanceKm</w:t>
-            </w:r>
-            <w:proofErr w:type="spellEnd"/>
-            <w:r>
-              <w:t xml:space="preserve">, </w:t>
-            </w:r>
-            <w:proofErr w:type="spellStart"/>
-            <w:r>
-              <w:t>eventType</w:t>
-            </w:r>
-            <w:proofErr w:type="spellEnd"/>
-            <w:r>
-              <w:t xml:space="preserve">, </w:t>
-            </w:r>
-            <w:proofErr w:type="spellStart"/>
-            <w:r>
-              <w:t>bannerImageUrl</w:t>
-            </w:r>
-            <w:proofErr w:type="spellEnd"/>
-            <w:r>
-              <w:t xml:space="preserve"> }</w:t>
+            <w:r>
+              <w:t>{ eventName, description, eventDate, location, distanceKm, eventType, bannerImageUrl }</w:t>
             </w:r>
           </w:p>
         </w:tc>
@@ -1982,21 +1698,7 @@
               <w:rPr>
                 <w:lang w:val="en-US"/>
               </w:rPr>
-              <w:t>/</w:t>
-            </w:r>
-            <w:proofErr w:type="spellStart"/>
-            <w:r>
-              <w:rPr>
-                <w:lang w:val="en-US"/>
-              </w:rPr>
-              <w:t>api</w:t>
-            </w:r>
-            <w:proofErr w:type="spellEnd"/>
-            <w:r>
-              <w:rPr>
-                <w:lang w:val="en-US"/>
-              </w:rPr>
-              <w:t>/events/{id}</w:t>
+              <w:t>/api/events/{id}</w:t>
             </w:r>
           </w:p>
         </w:tc>
@@ -2043,50 +1745,8 @@
                 <w:lang w:val="en-US"/>
               </w:rPr>
             </w:pPr>
-            <w:proofErr w:type="gramStart"/>
-            <w:r>
-              <w:t xml:space="preserve">{ </w:t>
-            </w:r>
-            <w:proofErr w:type="spellStart"/>
-            <w:r>
-              <w:t>eventName</w:t>
-            </w:r>
-            <w:proofErr w:type="spellEnd"/>
-            <w:proofErr w:type="gramEnd"/>
-            <w:r>
-              <w:t xml:space="preserve">, description, </w:t>
-            </w:r>
-            <w:proofErr w:type="spellStart"/>
-            <w:r>
-              <w:t>eventDate</w:t>
-            </w:r>
-            <w:proofErr w:type="spellEnd"/>
-            <w:r>
-              <w:t xml:space="preserve">, location, </w:t>
-            </w:r>
-            <w:proofErr w:type="spellStart"/>
-            <w:r>
-              <w:t>distanceKm</w:t>
-            </w:r>
-            <w:proofErr w:type="spellEnd"/>
-            <w:r>
-              <w:t xml:space="preserve">, </w:t>
-            </w:r>
-            <w:proofErr w:type="spellStart"/>
-            <w:r>
-              <w:t>eventType</w:t>
-            </w:r>
-            <w:proofErr w:type="spellEnd"/>
-            <w:r>
-              <w:t xml:space="preserve">, </w:t>
-            </w:r>
-            <w:proofErr w:type="spellStart"/>
-            <w:r>
-              <w:t>bannerImageUrl</w:t>
-            </w:r>
-            <w:proofErr w:type="spellEnd"/>
-            <w:r>
-              <w:t xml:space="preserve"> }</w:t>
+            <w:r>
+              <w:t>{ eventName, description, eventDate, location, distanceKm, eventType, bannerImageUrl }</w:t>
             </w:r>
           </w:p>
         </w:tc>
@@ -2134,15 +1794,7 @@
               </w:rPr>
             </w:pPr>
             <w:r>
-              <w:t>/</w:t>
-            </w:r>
-            <w:proofErr w:type="spellStart"/>
-            <w:r>
-              <w:t>api</w:t>
-            </w:r>
-            <w:proofErr w:type="spellEnd"/>
-            <w:r>
-              <w:t>/events/{id}</w:t>
+              <w:t>/api/events/{id}</w:t>
             </w:r>
           </w:p>
         </w:tc>
@@ -2398,23 +2050,7 @@
               </w:rPr>
             </w:pPr>
             <w:r>
-              <w:t>/</w:t>
-            </w:r>
-            <w:proofErr w:type="spellStart"/>
-            <w:r>
-              <w:t>api</w:t>
-            </w:r>
-            <w:proofErr w:type="spellEnd"/>
-            <w:r>
-              <w:t>/events/{</w:t>
-            </w:r>
-            <w:proofErr w:type="spellStart"/>
-            <w:r>
-              <w:t>eventId</w:t>
-            </w:r>
-            <w:proofErr w:type="spellEnd"/>
-            <w:r>
-              <w:t>}/categories</w:t>
+              <w:t>/api/events/{eventId}/categories</w:t>
             </w:r>
           </w:p>
         </w:tc>
@@ -2512,23 +2148,7 @@
               </w:rPr>
             </w:pPr>
             <w:r>
-              <w:t>/</w:t>
-            </w:r>
-            <w:proofErr w:type="spellStart"/>
-            <w:r>
-              <w:t>api</w:t>
-            </w:r>
-            <w:proofErr w:type="spellEnd"/>
-            <w:r>
-              <w:t>/events/{</w:t>
-            </w:r>
-            <w:proofErr w:type="spellStart"/>
-            <w:r>
-              <w:t>eventId</w:t>
-            </w:r>
-            <w:proofErr w:type="spellEnd"/>
-            <w:r>
-              <w:t>}/categories</w:t>
+              <w:t>/api/events/{eventId}/categories</w:t>
             </w:r>
           </w:p>
         </w:tc>
@@ -2575,42 +2195,8 @@
                 <w:lang w:val="en-US"/>
               </w:rPr>
             </w:pPr>
-            <w:proofErr w:type="gramStart"/>
-            <w:r>
-              <w:t xml:space="preserve">{ </w:t>
-            </w:r>
-            <w:proofErr w:type="spellStart"/>
-            <w:r>
-              <w:t>categoryName</w:t>
-            </w:r>
-            <w:proofErr w:type="spellEnd"/>
-            <w:proofErr w:type="gramEnd"/>
-            <w:r>
-              <w:t xml:space="preserve">, </w:t>
-            </w:r>
-            <w:proofErr w:type="spellStart"/>
-            <w:r>
-              <w:t>minAge</w:t>
-            </w:r>
-            <w:proofErr w:type="spellEnd"/>
-            <w:r>
-              <w:t xml:space="preserve">, </w:t>
-            </w:r>
-            <w:proofErr w:type="spellStart"/>
-            <w:r>
-              <w:t>maxAge</w:t>
-            </w:r>
-            <w:proofErr w:type="spellEnd"/>
-            <w:r>
-              <w:t xml:space="preserve">, </w:t>
-            </w:r>
-            <w:proofErr w:type="spellStart"/>
-            <w:r>
-              <w:t>distanceKm</w:t>
-            </w:r>
-            <w:proofErr w:type="spellEnd"/>
-            <w:r>
-              <w:t xml:space="preserve"> }</w:t>
+            <w:r>
+              <w:t>{ categoryName, minAge, maxAge, distanceKm }</w:t>
             </w:r>
           </w:p>
         </w:tc>
@@ -2626,13 +2212,8 @@
               </w:rPr>
             </w:pPr>
             <w:r>
-              <w:t xml:space="preserve">201 Created; 400 Bad Request; 403 </w:t>
-            </w:r>
-            <w:proofErr w:type="spellStart"/>
-            <w:r>
-              <w:t>Forbidd</w:t>
-            </w:r>
-            <w:proofErr w:type="spellEnd"/>
+              <w:t>201 Created; 400 Bad Request; 403 Forbidd</w:t>
+            </w:r>
           </w:p>
         </w:tc>
       </w:tr>
@@ -2668,15 +2249,7 @@
               </w:rPr>
             </w:pPr>
             <w:r>
-              <w:t>/</w:t>
-            </w:r>
-            <w:proofErr w:type="spellStart"/>
-            <w:r>
-              <w:t>api</w:t>
-            </w:r>
-            <w:proofErr w:type="spellEnd"/>
-            <w:r>
-              <w:t>/categories/{id}</w:t>
+              <w:t>/api/categories/{id}</w:t>
             </w:r>
           </w:p>
         </w:tc>
@@ -2723,42 +2296,8 @@
                 <w:lang w:val="en-US"/>
               </w:rPr>
             </w:pPr>
-            <w:proofErr w:type="gramStart"/>
-            <w:r>
-              <w:t xml:space="preserve">{ </w:t>
-            </w:r>
-            <w:proofErr w:type="spellStart"/>
-            <w:r>
-              <w:t>categoryName</w:t>
-            </w:r>
-            <w:proofErr w:type="spellEnd"/>
-            <w:proofErr w:type="gramEnd"/>
-            <w:r>
-              <w:t xml:space="preserve">, </w:t>
-            </w:r>
-            <w:proofErr w:type="spellStart"/>
-            <w:r>
-              <w:t>minAge</w:t>
-            </w:r>
-            <w:proofErr w:type="spellEnd"/>
-            <w:r>
-              <w:t xml:space="preserve">, </w:t>
-            </w:r>
-            <w:proofErr w:type="spellStart"/>
-            <w:r>
-              <w:t>maxAge</w:t>
-            </w:r>
-            <w:proofErr w:type="spellEnd"/>
-            <w:r>
-              <w:t xml:space="preserve">, </w:t>
-            </w:r>
-            <w:proofErr w:type="spellStart"/>
-            <w:r>
-              <w:t>distanceKm</w:t>
-            </w:r>
-            <w:proofErr w:type="spellEnd"/>
-            <w:r>
-              <w:t xml:space="preserve"> }</w:t>
+            <w:r>
+              <w:t>{ categoryName, minAge, maxAge, distanceKm }</w:t>
             </w:r>
           </w:p>
         </w:tc>
@@ -2808,15 +2347,7 @@
               </w:rPr>
             </w:pPr>
             <w:r>
-              <w:t>/</w:t>
-            </w:r>
-            <w:proofErr w:type="spellStart"/>
-            <w:r>
-              <w:t>api</w:t>
-            </w:r>
-            <w:proofErr w:type="spellEnd"/>
-            <w:r>
-              <w:t>/categories/{id}</w:t>
+              <w:t>/api/categories/{id}</w:t>
             </w:r>
           </w:p>
         </w:tc>
@@ -3067,23 +2598,7 @@
               </w:rPr>
             </w:pPr>
             <w:r>
-              <w:t>/</w:t>
-            </w:r>
-            <w:proofErr w:type="spellStart"/>
-            <w:r>
-              <w:t>api</w:t>
-            </w:r>
-            <w:proofErr w:type="spellEnd"/>
-            <w:r>
-              <w:t>/events/{</w:t>
-            </w:r>
-            <w:proofErr w:type="spellStart"/>
-            <w:r>
-              <w:t>eventId</w:t>
-            </w:r>
-            <w:proofErr w:type="spellEnd"/>
-            <w:r>
-              <w:t>}/enrolments</w:t>
+              <w:t>/api/events/{eventId}/enrolments</w:t>
             </w:r>
           </w:p>
         </w:tc>
@@ -3130,18 +2645,8 @@
                 <w:lang w:val="en-US"/>
               </w:rPr>
             </w:pPr>
-            <w:proofErr w:type="gramStart"/>
-            <w:r>
-              <w:t xml:space="preserve">{ </w:t>
-            </w:r>
-            <w:proofErr w:type="spellStart"/>
-            <w:r>
-              <w:t>categoryId</w:t>
-            </w:r>
-            <w:proofErr w:type="spellEnd"/>
-            <w:proofErr w:type="gramEnd"/>
-            <w:r>
-              <w:t xml:space="preserve"> }</w:t>
+            <w:r>
+              <w:t>{ categoryId }</w:t>
             </w:r>
           </w:p>
         </w:tc>
@@ -3197,21 +2702,7 @@
               <w:rPr>
                 <w:lang w:val="en-US"/>
               </w:rPr>
-              <w:t>/</w:t>
-            </w:r>
-            <w:proofErr w:type="spellStart"/>
-            <w:r>
-              <w:rPr>
-                <w:lang w:val="en-US"/>
-              </w:rPr>
-              <w:t>api</w:t>
-            </w:r>
-            <w:proofErr w:type="spellEnd"/>
-            <w:r>
-              <w:rPr>
-                <w:lang w:val="en-US"/>
-              </w:rPr>
-              <w:t>/enrolments/my</w:t>
+              <w:t>/api/enrolments/my</w:t>
             </w:r>
           </w:p>
         </w:tc>
@@ -3275,13 +2766,8 @@
               </w:rPr>
             </w:pPr>
             <w:r>
-              <w:t xml:space="preserve">200 OK; 403 </w:t>
-            </w:r>
-            <w:proofErr w:type="spellStart"/>
-            <w:r>
-              <w:t>Forbi</w:t>
-            </w:r>
-            <w:proofErr w:type="spellEnd"/>
+              <w:t>200 OK; 403 Forbi</w:t>
+            </w:r>
           </w:p>
         </w:tc>
       </w:tr>
@@ -3317,23 +2803,7 @@
               </w:rPr>
             </w:pPr>
             <w:r>
-              <w:t>/</w:t>
-            </w:r>
-            <w:proofErr w:type="spellStart"/>
-            <w:r>
-              <w:t>api</w:t>
-            </w:r>
-            <w:proofErr w:type="spellEnd"/>
-            <w:r>
-              <w:t>/events/{</w:t>
-            </w:r>
-            <w:proofErr w:type="spellStart"/>
-            <w:r>
-              <w:t>eventId</w:t>
-            </w:r>
-            <w:proofErr w:type="spellEnd"/>
-            <w:r>
-              <w:t>}/enrolments</w:t>
+              <w:t>/api/events/{eventId}/enrolments</w:t>
             </w:r>
           </w:p>
         </w:tc>
@@ -3529,15 +2999,7 @@
               </w:rPr>
             </w:pPr>
             <w:r>
-              <w:t>/</w:t>
-            </w:r>
-            <w:proofErr w:type="spellStart"/>
-            <w:r>
-              <w:t>api</w:t>
-            </w:r>
-            <w:proofErr w:type="spellEnd"/>
-            <w:r>
-              <w:t>/enrolments/{id}/status</w:t>
+              <w:t>/api/enrolments/{id}/status</w:t>
             </w:r>
           </w:p>
         </w:tc>
@@ -3584,18 +3046,8 @@
                 <w:lang w:val="en-US"/>
               </w:rPr>
             </w:pPr>
-            <w:proofErr w:type="gramStart"/>
-            <w:r>
-              <w:t xml:space="preserve">{ </w:t>
-            </w:r>
-            <w:proofErr w:type="spellStart"/>
-            <w:r>
-              <w:t>enrolmentStatus</w:t>
-            </w:r>
-            <w:proofErr w:type="spellEnd"/>
-            <w:proofErr w:type="gramEnd"/>
-            <w:r>
-              <w:t xml:space="preserve"> }</w:t>
+            <w:r>
+              <w:t>{ enrolmentStatus }</w:t>
             </w:r>
           </w:p>
         </w:tc>
@@ -3803,23 +3255,7 @@
               </w:rPr>
             </w:pPr>
             <w:r>
-              <w:t>/</w:t>
-            </w:r>
-            <w:proofErr w:type="spellStart"/>
-            <w:r>
-              <w:t>api</w:t>
-            </w:r>
-            <w:proofErr w:type="spellEnd"/>
-            <w:r>
-              <w:t>/events/{</w:t>
-            </w:r>
-            <w:proofErr w:type="spellStart"/>
-            <w:r>
-              <w:t>eventId</w:t>
-            </w:r>
-            <w:proofErr w:type="spellEnd"/>
-            <w:r>
-              <w:t>}/results</w:t>
+              <w:t>/api/events/{eventId}/results</w:t>
             </w:r>
           </w:p>
         </w:tc>
@@ -3866,34 +3302,8 @@
                 <w:lang w:val="en-US"/>
               </w:rPr>
             </w:pPr>
-            <w:proofErr w:type="gramStart"/>
-            <w:r>
-              <w:t xml:space="preserve">{ </w:t>
-            </w:r>
-            <w:proofErr w:type="spellStart"/>
-            <w:r>
-              <w:t>enrolmentId</w:t>
-            </w:r>
-            <w:proofErr w:type="spellEnd"/>
-            <w:proofErr w:type="gramEnd"/>
-            <w:r>
-              <w:t xml:space="preserve">, </w:t>
-            </w:r>
-            <w:proofErr w:type="spellStart"/>
-            <w:r>
-              <w:t>finishTime</w:t>
-            </w:r>
-            <w:proofErr w:type="spellEnd"/>
-            <w:r>
-              <w:t xml:space="preserve">, </w:t>
-            </w:r>
-            <w:proofErr w:type="spellStart"/>
-            <w:r>
-              <w:t>finishingPosition</w:t>
-            </w:r>
-            <w:proofErr w:type="spellEnd"/>
-            <w:r>
-              <w:t xml:space="preserve"> }</w:t>
+            <w:r>
+              <w:t>{ enrolmentId, finishTime, finishingPosition }</w:t>
             </w:r>
           </w:p>
         </w:tc>
@@ -3909,13 +3319,8 @@
               </w:rPr>
             </w:pPr>
             <w:r>
-              <w:t xml:space="preserve">201 Created; 400 Bad Request; 403 Forbidden; 404 Not Found; 409 </w:t>
-            </w:r>
-            <w:proofErr w:type="spellStart"/>
-            <w:r>
-              <w:t>Confl</w:t>
-            </w:r>
-            <w:proofErr w:type="spellEnd"/>
+              <w:t>201 Created; 400 Bad Request; 403 Forbidden; 404 Not Found; 409 Confl</w:t>
+            </w:r>
           </w:p>
         </w:tc>
       </w:tr>
@@ -3951,21 +3356,7 @@
               <w:rPr>
                 <w:lang w:val="en-US"/>
               </w:rPr>
-              <w:t>/</w:t>
-            </w:r>
-            <w:proofErr w:type="spellStart"/>
-            <w:r>
-              <w:rPr>
-                <w:lang w:val="en-US"/>
-              </w:rPr>
-              <w:t>api</w:t>
-            </w:r>
-            <w:proofErr w:type="spellEnd"/>
-            <w:r>
-              <w:rPr>
-                <w:lang w:val="en-US"/>
-              </w:rPr>
-              <w:t>/results/my</w:t>
+              <w:t>/api/results/my</w:t>
             </w:r>
           </w:p>
         </w:tc>
@@ -4066,23 +3457,7 @@
               </w:rPr>
             </w:pPr>
             <w:r>
-              <w:t>/</w:t>
-            </w:r>
-            <w:proofErr w:type="spellStart"/>
-            <w:r>
-              <w:t>api</w:t>
-            </w:r>
-            <w:proofErr w:type="spellEnd"/>
-            <w:r>
-              <w:t>/events/{</w:t>
-            </w:r>
-            <w:proofErr w:type="spellStart"/>
-            <w:r>
-              <w:t>eventId</w:t>
-            </w:r>
-            <w:proofErr w:type="spellEnd"/>
-            <w:r>
-              <w:t>}/results</w:t>
+              <w:t>/api/events/{eventId}/results</w:t>
             </w:r>
           </w:p>
         </w:tc>
@@ -4180,15 +3555,7 @@
               </w:rPr>
             </w:pPr>
             <w:r>
-              <w:t>/</w:t>
-            </w:r>
-            <w:proofErr w:type="spellStart"/>
-            <w:r>
-              <w:t>api</w:t>
-            </w:r>
-            <w:proofErr w:type="spellEnd"/>
-            <w:r>
-              <w:t>/results/{id}</w:t>
+              <w:t>/api/results/{id}</w:t>
             </w:r>
           </w:p>
         </w:tc>
@@ -4244,26 +3611,8 @@
                 <w:lang w:val="en-US"/>
               </w:rPr>
             </w:pPr>
-            <w:proofErr w:type="gramStart"/>
-            <w:r>
-              <w:t xml:space="preserve">{ </w:t>
-            </w:r>
-            <w:proofErr w:type="spellStart"/>
-            <w:r>
-              <w:t>finishTime</w:t>
-            </w:r>
-            <w:proofErr w:type="spellEnd"/>
-            <w:proofErr w:type="gramEnd"/>
-            <w:r>
-              <w:t xml:space="preserve">, </w:t>
-            </w:r>
-            <w:proofErr w:type="spellStart"/>
-            <w:r>
-              <w:t>finishingPosition</w:t>
-            </w:r>
-            <w:proofErr w:type="spellEnd"/>
-            <w:r>
-              <w:t xml:space="preserve"> }</w:t>
+            <w:r>
+              <w:t>{ finishTime, finishingPosition }</w:t>
             </w:r>
           </w:p>
         </w:tc>
@@ -4297,16 +3646,275 @@
         <w:rPr>
           <w:lang w:val="en-US"/>
         </w:rPr>
+        <w:sectPr>
+          <w:headerReference w:type="even" r:id="rId8"/>
+          <w:headerReference w:type="default" r:id="rId9"/>
+          <w:footerReference w:type="even" r:id="rId10"/>
+          <w:footerReference w:type="default" r:id="rId11"/>
+          <w:headerReference w:type="first" r:id="rId12"/>
+          <w:footerReference w:type="first" r:id="rId13"/>
+          <w:pgSz w:w="16838" w:h="11906" w:orient="landscape"/>
+          <w:pgMar w:top="1440" w:right="1440" w:bottom="1440" w:left="1440" w:header="708" w:footer="708" w:gutter="0"/>
+          <w:cols w:space="708"/>
+          <w:docGrid w:linePitch="360"/>
+        </w:sectPr>
+      </w:pPr>
+    </w:p>
+    <w:p>
+      <w:pPr>
+        <w:rPr>
+          <w:lang w:val="en-US"/>
+        </w:rPr>
+      </w:pPr>
+      <w:r>
+        <w:rPr>
+          <w:lang w:val="en-US"/>
+        </w:rPr>
+        <w:lastRenderedPageBreak/>
+        <w:t xml:space="preserve">3.8 The API </w:t>
+      </w:r>
+      <w:r>
+        <w:rPr>
+          <w:lang w:val="en-US"/>
+        </w:rPr>
+        <w:t>D</w:t>
+      </w:r>
+      <w:r>
+        <w:rPr>
+          <w:lang w:val="en-US"/>
+        </w:rPr>
+        <w:t>esign</w:t>
+      </w:r>
+      <w:r>
+        <w:rPr>
+          <w:lang w:val="en-US"/>
+        </w:rPr>
+        <w:t xml:space="preserve"> Decisions</w:t>
+      </w:r>
+    </w:p>
+    <w:p>
+      <w:pPr>
+        <w:rPr>
+          <w:lang w:val="en-US"/>
+        </w:rPr>
+      </w:pPr>
+      <w:r>
+        <w:rPr>
+          <w:lang w:val="en-US"/>
+        </w:rPr>
+        <w:t>The endpoint design follows the two-role structure of the RaceDay system.</w:t>
+      </w:r>
+    </w:p>
+    <w:p>
+      <w:pPr>
+        <w:rPr>
+          <w:lang w:val="en-US"/>
+        </w:rPr>
+      </w:pPr>
+      <w:r>
+        <w:rPr>
+          <w:lang w:val="en-US"/>
+        </w:rPr>
+        <w:t>Organizers</w:t>
+      </w:r>
+      <w:r>
+        <w:rPr>
+          <w:lang w:val="en-US"/>
+        </w:rPr>
+        <w:t xml:space="preserve"> have access to event management functionality, while Participants have access to event enrolment and their own results.</w:t>
+      </w:r>
+    </w:p>
+    <w:p>
+      <w:pPr>
+        <w:rPr>
+          <w:lang w:val="en-US"/>
+        </w:rPr>
+      </w:pPr>
+      <w:r>
+        <w:rPr>
+          <w:lang w:val="en-US"/>
+        </w:rPr>
+        <w:t xml:space="preserve">Ownership checks will also be required. For example, an </w:t>
+      </w:r>
+      <w:r>
+        <w:rPr>
+          <w:lang w:val="en-US"/>
+        </w:rPr>
+        <w:t>Organizer</w:t>
+      </w:r>
+      <w:r>
+        <w:rPr>
+          <w:lang w:val="en-US"/>
+        </w:rPr>
+        <w:t xml:space="preserve"> should only be able to modify events that they own.</w:t>
+      </w:r>
+    </w:p>
+    <w:p>
+      <w:pPr>
+        <w:rPr>
+          <w:lang w:val="en-US"/>
+        </w:rPr>
+      </w:pPr>
+      <w:r>
+        <w:rPr>
+          <w:lang w:val="en-US"/>
+        </w:rPr>
+        <w:t>Participants should only be able to view their own enrolments and results.</w:t>
+      </w:r>
+    </w:p>
+    <w:p>
+      <w:pPr>
+        <w:rPr>
+          <w:lang w:val="en-US"/>
+        </w:rPr>
+      </w:pPr>
+      <w:r>
+        <w:rPr>
+          <w:lang w:val="en-US"/>
+        </w:rPr>
+        <w:t>The endpoint plan will serve as the specification for Part 2. The POE states that the implemented API should closely match the Part 1 plan and unexplained deviations may affect the mark.</w:t>
+      </w:r>
+      <w:r>
+        <w:rPr>
+          <w:lang w:val="en-US"/>
+        </w:rPr>
+        <w:t xml:space="preserve"> </w:t>
+      </w:r>
+    </w:p>
+    <w:p>
+      <w:pPr>
+        <w:rPr>
+          <w:lang w:val="en-US"/>
+        </w:rPr>
       </w:pPr>
     </w:p>
     <w:sectPr>
-      <w:pgSz w:w="16838" w:h="11906" w:orient="landscape"/>
+      <w:pgSz w:w="11906" w:h="16838"/>
       <w:pgMar w:top="1440" w:right="1440" w:bottom="1440" w:left="1440" w:header="708" w:footer="708" w:gutter="0"/>
       <w:cols w:space="708"/>
       <w:docGrid w:linePitch="360"/>
     </w:sectPr>
   </w:body>
 </w:document>
+</file>
+
+<file path=word/endnotes.xml><?xml version="1.0" encoding="utf-8"?>
+<w:endnotes xmlns:wpc="http://schemas.microsoft.com/office/word/2010/wordprocessingCanvas" xmlns:cx="http://schemas.microsoft.com/office/drawing/2014/chartex" xmlns:cx1="http://schemas.microsoft.com/office/drawing/2015/9/8/chartex" xmlns:cx2="http://schemas.microsoft.com/office/drawing/2015/10/21/chartex" xmlns:cx3="http://schemas.microsoft.com/office/drawing/2016/5/9/chartex" xmlns:cx4="http://schemas.microsoft.com/office/drawing/2016/5/10/chartex" xmlns:cx5="http://schemas.microsoft.com/office/drawing/2016/5/11/chartex" xmlns:cx6="http://schemas.microsoft.com/office/drawing/2016/5/12/chartex" xmlns:cx7="http://schemas.microsoft.com/office/drawing/2016/5/13/chartex" xmlns:cx8="http://schemas.microsoft.com/office/drawing/2016/5/14/chartex" xmlns:mc="http://schemas.openxmlformats.org/markup-compatibility/2006" xmlns:aink="http://schemas.microsoft.com/office/drawing/2016/ink" xmlns:am3d="http://schemas.microsoft.com/office/drawing/2017/model3d" xmlns:o="urn:schemas-microsoft-com:office:office" xmlns:r="http://schemas.openxmlformats.org/officeDocument/2006/relationships" xmlns:m="http://schemas.openxmlformats.org/officeDocument/2006/math" xmlns:v="urn:schemas-microsoft-com:vml" xmlns:wp14="http://schemas.microsoft.com/office/word/2010/wordprocessingDrawing" xmlns:wp="http://schemas.openxmlformats.org/drawingml/2006/wordprocessingDrawing" xmlns:w10="urn:schemas-microsoft-com:office:word" xmlns:w="http://schemas.openxmlformats.org/wordprocessingml/2006/main" xmlns:w14="http://schemas.microsoft.com/office/word/2010/wordml" xmlns:w15="http://schemas.microsoft.com/office/word/2012/wordml" xmlns:w16cex="http://schemas.microsoft.com/office/word/2018/wordml/cex" xmlns:w16cid="http://schemas.microsoft.com/office/word/2016/wordml/cid" xmlns:w16="http://schemas.microsoft.com/office/word/2018/wordml" xmlns:w16sdtdh="http://schemas.microsoft.com/office/word/2020/wordml/sdtdatahash" xmlns:w16se="http://schemas.microsoft.com/office/word/2015/wordml/symex" xmlns:wpg="http://schemas.microsoft.com/office/word/2010/wordprocessingGroup" xmlns:wpi="http://schemas.microsoft.com/office/word/2010/wordprocessingInk" xmlns:wne="http://schemas.microsoft.com/office/word/2006/wordml" xmlns:wps="http://schemas.microsoft.com/office/word/2010/wordprocessingShape" mc:Ignorable="w14 w15 w16se w16cid w16 w16cex w16sdtdh wp14">
+  <w:endnote w:type="separator" w:id="-1">
+    <w:p>
+      <w:pPr>
+        <w:spacing w:after="0" w:line="240" w:lineRule="auto"/>
+      </w:pPr>
+      <w:r>
+        <w:separator/>
+      </w:r>
+    </w:p>
+  </w:endnote>
+  <w:endnote w:type="continuationSeparator" w:id="0">
+    <w:p>
+      <w:pPr>
+        <w:spacing w:after="0" w:line="240" w:lineRule="auto"/>
+      </w:pPr>
+      <w:r>
+        <w:continuationSeparator/>
+      </w:r>
+    </w:p>
+  </w:endnote>
+</w:endnotes>
+</file>
+
+<file path=word/footer1.xml><?xml version="1.0" encoding="utf-8"?>
+<w:ftr xmlns:wpc="http://schemas.microsoft.com/office/word/2010/wordprocessingCanvas" xmlns:cx="http://schemas.microsoft.com/office/drawing/2014/chartex" xmlns:cx1="http://schemas.microsoft.com/office/drawing/2015/9/8/chartex" xmlns:cx2="http://schemas.microsoft.com/office/drawing/2015/10/21/chartex" xmlns:cx3="http://schemas.microsoft.com/office/drawing/2016/5/9/chartex" xmlns:cx4="http://schemas.microsoft.com/office/drawing/2016/5/10/chartex" xmlns:cx5="http://schemas.microsoft.com/office/drawing/2016/5/11/chartex" xmlns:cx6="http://schemas.microsoft.com/office/drawing/2016/5/12/chartex" xmlns:cx7="http://schemas.microsoft.com/office/drawing/2016/5/13/chartex" xmlns:cx8="http://schemas.microsoft.com/office/drawing/2016/5/14/chartex" xmlns:mc="http://schemas.openxmlformats.org/markup-compatibility/2006" xmlns:aink="http://schemas.microsoft.com/office/drawing/2016/ink" xmlns:am3d="http://schemas.microsoft.com/office/drawing/2017/model3d" xmlns:o="urn:schemas-microsoft-com:office:office" xmlns:r="http://schemas.openxmlformats.org/officeDocument/2006/relationships" xmlns:m="http://schemas.openxmlformats.org/officeDocument/2006/math" xmlns:v="urn:schemas-microsoft-com:vml" xmlns:wp14="http://schemas.microsoft.com/office/word/2010/wordprocessingDrawing" xmlns:wp="http://schemas.openxmlformats.org/drawingml/2006/wordprocessingDrawing" xmlns:w10="urn:schemas-microsoft-com:office:word" xmlns:w="http://schemas.openxmlformats.org/wordprocessingml/2006/main" xmlns:w14="http://schemas.microsoft.com/office/word/2010/wordml" xmlns:w15="http://schemas.microsoft.com/office/word/2012/wordml" xmlns:w16cex="http://schemas.microsoft.com/office/word/2018/wordml/cex" xmlns:w16cid="http://schemas.microsoft.com/office/word/2016/wordml/cid" xmlns:w16="http://schemas.microsoft.com/office/word/2018/wordml" xmlns:w16sdtdh="http://schemas.microsoft.com/office/word/2020/wordml/sdtdatahash" xmlns:w16se="http://schemas.microsoft.com/office/word/2015/wordml/symex" xmlns:wpg="http://schemas.microsoft.com/office/word/2010/wordprocessingGroup" xmlns:wpi="http://schemas.microsoft.com/office/word/2010/wordprocessingInk" xmlns:wne="http://schemas.microsoft.com/office/word/2006/wordml" xmlns:wps="http://schemas.microsoft.com/office/word/2010/wordprocessingShape" mc:Ignorable="w14 w15 w16se w16cid w16 w16cex w16sdtdh wp14">
+  <w:p>
+    <w:pPr>
+      <w:pStyle w:val="Footer"/>
+    </w:pPr>
+  </w:p>
+</w:ftr>
+</file>
+
+<file path=word/footer2.xml><?xml version="1.0" encoding="utf-8"?>
+<w:ftr xmlns:wpc="http://schemas.microsoft.com/office/word/2010/wordprocessingCanvas" xmlns:cx="http://schemas.microsoft.com/office/drawing/2014/chartex" xmlns:cx1="http://schemas.microsoft.com/office/drawing/2015/9/8/chartex" xmlns:cx2="http://schemas.microsoft.com/office/drawing/2015/10/21/chartex" xmlns:cx3="http://schemas.microsoft.com/office/drawing/2016/5/9/chartex" xmlns:cx4="http://schemas.microsoft.com/office/drawing/2016/5/10/chartex" xmlns:cx5="http://schemas.microsoft.com/office/drawing/2016/5/11/chartex" xmlns:cx6="http://schemas.microsoft.com/office/drawing/2016/5/12/chartex" xmlns:cx7="http://schemas.microsoft.com/office/drawing/2016/5/13/chartex" xmlns:cx8="http://schemas.microsoft.com/office/drawing/2016/5/14/chartex" xmlns:mc="http://schemas.openxmlformats.org/markup-compatibility/2006" xmlns:aink="http://schemas.microsoft.com/office/drawing/2016/ink" xmlns:am3d="http://schemas.microsoft.com/office/drawing/2017/model3d" xmlns:o="urn:schemas-microsoft-com:office:office" xmlns:r="http://schemas.openxmlformats.org/officeDocument/2006/relationships" xmlns:m="http://schemas.openxmlformats.org/officeDocument/2006/math" xmlns:v="urn:schemas-microsoft-com:vml" xmlns:wp14="http://schemas.microsoft.com/office/word/2010/wordprocessingDrawing" xmlns:wp="http://schemas.openxmlformats.org/drawingml/2006/wordprocessingDrawing" xmlns:w10="urn:schemas-microsoft-com:office:word" xmlns:w="http://schemas.openxmlformats.org/wordprocessingml/2006/main" xmlns:w14="http://schemas.microsoft.com/office/word/2010/wordml" xmlns:w15="http://schemas.microsoft.com/office/word/2012/wordml" xmlns:w16cex="http://schemas.microsoft.com/office/word/2018/wordml/cex" xmlns:w16cid="http://schemas.microsoft.com/office/word/2016/wordml/cid" xmlns:w16="http://schemas.microsoft.com/office/word/2018/wordml" xmlns:w16sdtdh="http://schemas.microsoft.com/office/word/2020/wordml/sdtdatahash" xmlns:w16se="http://schemas.microsoft.com/office/word/2015/wordml/symex" xmlns:wpg="http://schemas.microsoft.com/office/word/2010/wordprocessingGroup" xmlns:wpi="http://schemas.microsoft.com/office/word/2010/wordprocessingInk" xmlns:wne="http://schemas.microsoft.com/office/word/2006/wordml" xmlns:wps="http://schemas.microsoft.com/office/word/2010/wordprocessingShape" mc:Ignorable="w14 w15 w16se w16cid w16 w16cex w16sdtdh wp14">
+  <w:p>
+    <w:pPr>
+      <w:pStyle w:val="Footer"/>
+    </w:pPr>
+  </w:p>
+</w:ftr>
+</file>
+
+<file path=word/footer3.xml><?xml version="1.0" encoding="utf-8"?>
+<w:ftr xmlns:wpc="http://schemas.microsoft.com/office/word/2010/wordprocessingCanvas" xmlns:cx="http://schemas.microsoft.com/office/drawing/2014/chartex" xmlns:cx1="http://schemas.microsoft.com/office/drawing/2015/9/8/chartex" xmlns:cx2="http://schemas.microsoft.com/office/drawing/2015/10/21/chartex" xmlns:cx3="http://schemas.microsoft.com/office/drawing/2016/5/9/chartex" xmlns:cx4="http://schemas.microsoft.com/office/drawing/2016/5/10/chartex" xmlns:cx5="http://schemas.microsoft.com/office/drawing/2016/5/11/chartex" xmlns:cx6="http://schemas.microsoft.com/office/drawing/2016/5/12/chartex" xmlns:cx7="http://schemas.microsoft.com/office/drawing/2016/5/13/chartex" xmlns:cx8="http://schemas.microsoft.com/office/drawing/2016/5/14/chartex" xmlns:mc="http://schemas.openxmlformats.org/markup-compatibility/2006" xmlns:aink="http://schemas.microsoft.com/office/drawing/2016/ink" xmlns:am3d="http://schemas.microsoft.com/office/drawing/2017/model3d" xmlns:o="urn:schemas-microsoft-com:office:office" xmlns:r="http://schemas.openxmlformats.org/officeDocument/2006/relationships" xmlns:m="http://schemas.openxmlformats.org/officeDocument/2006/math" xmlns:v="urn:schemas-microsoft-com:vml" xmlns:wp14="http://schemas.microsoft.com/office/word/2010/wordprocessingDrawing" xmlns:wp="http://schemas.openxmlformats.org/drawingml/2006/wordprocessingDrawing" xmlns:w10="urn:schemas-microsoft-com:office:word" xmlns:w="http://schemas.openxmlformats.org/wordprocessingml/2006/main" xmlns:w14="http://schemas.microsoft.com/office/word/2010/wordml" xmlns:w15="http://schemas.microsoft.com/office/word/2012/wordml" xmlns:w16cex="http://schemas.microsoft.com/office/word/2018/wordml/cex" xmlns:w16cid="http://schemas.microsoft.com/office/word/2016/wordml/cid" xmlns:w16="http://schemas.microsoft.com/office/word/2018/wordml" xmlns:w16sdtdh="http://schemas.microsoft.com/office/word/2020/wordml/sdtdatahash" xmlns:w16se="http://schemas.microsoft.com/office/word/2015/wordml/symex" xmlns:wpg="http://schemas.microsoft.com/office/word/2010/wordprocessingGroup" xmlns:wpi="http://schemas.microsoft.com/office/word/2010/wordprocessingInk" xmlns:wne="http://schemas.microsoft.com/office/word/2006/wordml" xmlns:wps="http://schemas.microsoft.com/office/word/2010/wordprocessingShape" mc:Ignorable="w14 w15 w16se w16cid w16 w16cex w16sdtdh wp14">
+  <w:p>
+    <w:pPr>
+      <w:pStyle w:val="Footer"/>
+    </w:pPr>
+  </w:p>
+</w:ftr>
+</file>
+
+<file path=word/footnotes.xml><?xml version="1.0" encoding="utf-8"?>
+<w:footnotes xmlns:wpc="http://schemas.microsoft.com/office/word/2010/wordprocessingCanvas" xmlns:cx="http://schemas.microsoft.com/office/drawing/2014/chartex" xmlns:cx1="http://schemas.microsoft.com/office/drawing/2015/9/8/chartex" xmlns:cx2="http://schemas.microsoft.com/office/drawing/2015/10/21/chartex" xmlns:cx3="http://schemas.microsoft.com/office/drawing/2016/5/9/chartex" xmlns:cx4="http://schemas.microsoft.com/office/drawing/2016/5/10/chartex" xmlns:cx5="http://schemas.microsoft.com/office/drawing/2016/5/11/chartex" xmlns:cx6="http://schemas.microsoft.com/office/drawing/2016/5/12/chartex" xmlns:cx7="http://schemas.microsoft.com/office/drawing/2016/5/13/chartex" xmlns:cx8="http://schemas.microsoft.com/office/drawing/2016/5/14/chartex" xmlns:mc="http://schemas.openxmlformats.org/markup-compatibility/2006" xmlns:aink="http://schemas.microsoft.com/office/drawing/2016/ink" xmlns:am3d="http://schemas.microsoft.com/office/drawing/2017/model3d" xmlns:o="urn:schemas-microsoft-com:office:office" xmlns:r="http://schemas.openxmlformats.org/officeDocument/2006/relationships" xmlns:m="http://schemas.openxmlformats.org/officeDocument/2006/math" xmlns:v="urn:schemas-microsoft-com:vml" xmlns:wp14="http://schemas.microsoft.com/office/word/2010/wordprocessingDrawing" xmlns:wp="http://schemas.openxmlformats.org/drawingml/2006/wordprocessingDrawing" xmlns:w10="urn:schemas-microsoft-com:office:word" xmlns:w="http://schemas.openxmlformats.org/wordprocessingml/2006/main" xmlns:w14="http://schemas.microsoft.com/office/word/2010/wordml" xmlns:w15="http://schemas.microsoft.com/office/word/2012/wordml" xmlns:w16cex="http://schemas.microsoft.com/office/word/2018/wordml/cex" xmlns:w16cid="http://schemas.microsoft.com/office/word/2016/wordml/cid" xmlns:w16="http://schemas.microsoft.com/office/word/2018/wordml" xmlns:w16sdtdh="http://schemas.microsoft.com/office/word/2020/wordml/sdtdatahash" xmlns:w16se="http://schemas.microsoft.com/office/word/2015/wordml/symex" xmlns:wpg="http://schemas.microsoft.com/office/word/2010/wordprocessingGroup" xmlns:wpi="http://schemas.microsoft.com/office/word/2010/wordprocessingInk" xmlns:wne="http://schemas.microsoft.com/office/word/2006/wordml" xmlns:wps="http://schemas.microsoft.com/office/word/2010/wordprocessingShape" mc:Ignorable="w14 w15 w16se w16cid w16 w16cex w16sdtdh wp14">
+  <w:footnote w:type="separator" w:id="-1">
+    <w:p>
+      <w:pPr>
+        <w:spacing w:after="0" w:line="240" w:lineRule="auto"/>
+      </w:pPr>
+      <w:r>
+        <w:separator/>
+      </w:r>
+    </w:p>
+  </w:footnote>
+  <w:footnote w:type="continuationSeparator" w:id="0">
+    <w:p>
+      <w:pPr>
+        <w:spacing w:after="0" w:line="240" w:lineRule="auto"/>
+      </w:pPr>
+      <w:r>
+        <w:continuationSeparator/>
+      </w:r>
+    </w:p>
+  </w:footnote>
+</w:footnotes>
+</file>
+
+<file path=word/header1.xml><?xml version="1.0" encoding="utf-8"?>
+<w:hdr xmlns:wpc="http://schemas.microsoft.com/office/word/2010/wordprocessingCanvas" xmlns:cx="http://schemas.microsoft.com/office/drawing/2014/chartex" xmlns:cx1="http://schemas.microsoft.com/office/drawing/2015/9/8/chartex" xmlns:cx2="http://schemas.microsoft.com/office/drawing/2015/10/21/chartex" xmlns:cx3="http://schemas.microsoft.com/office/drawing/2016/5/9/chartex" xmlns:cx4="http://schemas.microsoft.com/office/drawing/2016/5/10/chartex" xmlns:cx5="http://schemas.microsoft.com/office/drawing/2016/5/11/chartex" xmlns:cx6="http://schemas.microsoft.com/office/drawing/2016/5/12/chartex" xmlns:cx7="http://schemas.microsoft.com/office/drawing/2016/5/13/chartex" xmlns:cx8="http://schemas.microsoft.com/office/drawing/2016/5/14/chartex" xmlns:mc="http://schemas.openxmlformats.org/markup-compatibility/2006" xmlns:aink="http://schemas.microsoft.com/office/drawing/2016/ink" xmlns:am3d="http://schemas.microsoft.com/office/drawing/2017/model3d" xmlns:o="urn:schemas-microsoft-com:office:office" xmlns:r="http://schemas.openxmlformats.org/officeDocument/2006/relationships" xmlns:m="http://schemas.openxmlformats.org/officeDocument/2006/math" xmlns:v="urn:schemas-microsoft-com:vml" xmlns:wp14="http://schemas.microsoft.com/office/word/2010/wordprocessingDrawing" xmlns:wp="http://schemas.openxmlformats.org/drawingml/2006/wordprocessingDrawing" xmlns:w10="urn:schemas-microsoft-com:office:word" xmlns:w="http://schemas.openxmlformats.org/wordprocessingml/2006/main" xmlns:w14="http://schemas.microsoft.com/office/word/2010/wordml" xmlns:w15="http://schemas.microsoft.com/office/word/2012/wordml" xmlns:w16cex="http://schemas.microsoft.com/office/word/2018/wordml/cex" xmlns:w16cid="http://schemas.microsoft.com/office/word/2016/wordml/cid" xmlns:w16="http://schemas.microsoft.com/office/word/2018/wordml" xmlns:w16sdtdh="http://schemas.microsoft.com/office/word/2020/wordml/sdtdatahash" xmlns:w16se="http://schemas.microsoft.com/office/word/2015/wordml/symex" xmlns:wpg="http://schemas.microsoft.com/office/word/2010/wordprocessingGroup" xmlns:wpi="http://schemas.microsoft.com/office/word/2010/wordprocessingInk" xmlns:wne="http://schemas.microsoft.com/office/word/2006/wordml" xmlns:wps="http://schemas.microsoft.com/office/word/2010/wordprocessingShape" mc:Ignorable="w14 w15 w16se w16cid w16 w16cex w16sdtdh wp14">
+  <w:p>
+    <w:pPr>
+      <w:pStyle w:val="Header"/>
+    </w:pPr>
+  </w:p>
+</w:hdr>
+</file>
+
+<file path=word/header2.xml><?xml version="1.0" encoding="utf-8"?>
+<w:hdr xmlns:wpc="http://schemas.microsoft.com/office/word/2010/wordprocessingCanvas" xmlns:cx="http://schemas.microsoft.com/office/drawing/2014/chartex" xmlns:cx1="http://schemas.microsoft.com/office/drawing/2015/9/8/chartex" xmlns:cx2="http://schemas.microsoft.com/office/drawing/2015/10/21/chartex" xmlns:cx3="http://schemas.microsoft.com/office/drawing/2016/5/9/chartex" xmlns:cx4="http://schemas.microsoft.com/office/drawing/2016/5/10/chartex" xmlns:cx5="http://schemas.microsoft.com/office/drawing/2016/5/11/chartex" xmlns:cx6="http://schemas.microsoft.com/office/drawing/2016/5/12/chartex" xmlns:cx7="http://schemas.microsoft.com/office/drawing/2016/5/13/chartex" xmlns:cx8="http://schemas.microsoft.com/office/drawing/2016/5/14/chartex" xmlns:mc="http://schemas.openxmlformats.org/markup-compatibility/2006" xmlns:aink="http://schemas.microsoft.com/office/drawing/2016/ink" xmlns:am3d="http://schemas.microsoft.com/office/drawing/2017/model3d" xmlns:o="urn:schemas-microsoft-com:office:office" xmlns:r="http://schemas.openxmlformats.org/officeDocument/2006/relationships" xmlns:m="http://schemas.openxmlformats.org/officeDocument/2006/math" xmlns:v="urn:schemas-microsoft-com:vml" xmlns:wp14="http://schemas.microsoft.com/office/word/2010/wordprocessingDrawing" xmlns:wp="http://schemas.openxmlformats.org/drawingml/2006/wordprocessingDrawing" xmlns:w10="urn:schemas-microsoft-com:office:word" xmlns:w="http://schemas.openxmlformats.org/wordprocessingml/2006/main" xmlns:w14="http://schemas.microsoft.com/office/word/2010/wordml" xmlns:w15="http://schemas.microsoft.com/office/word/2012/wordml" xmlns:w16cex="http://schemas.microsoft.com/office/word/2018/wordml/cex" xmlns:w16cid="http://schemas.microsoft.com/office/word/2016/wordml/cid" xmlns:w16="http://schemas.microsoft.com/office/word/2018/wordml" xmlns:w16sdtdh="http://schemas.microsoft.com/office/word/2020/wordml/sdtdatahash" xmlns:w16se="http://schemas.microsoft.com/office/word/2015/wordml/symex" xmlns:wpg="http://schemas.microsoft.com/office/word/2010/wordprocessingGroup" xmlns:wpi="http://schemas.microsoft.com/office/word/2010/wordprocessingInk" xmlns:wne="http://schemas.microsoft.com/office/word/2006/wordml" xmlns:wps="http://schemas.microsoft.com/office/word/2010/wordprocessingShape" mc:Ignorable="w14 w15 w16se w16cid w16 w16cex w16sdtdh wp14">
+  <w:p>
+    <w:pPr>
+      <w:pStyle w:val="Header"/>
+      <w:rPr>
+        <w:lang w:val="en-US"/>
+      </w:rPr>
+    </w:pPr>
+    <w:r>
+      <w:rPr>
+        <w:lang w:val="en-US"/>
+      </w:rPr>
+      <w:t>ST10073464</w:t>
+    </w:r>
+  </w:p>
+</w:hdr>
+</file>
+
+<file path=word/header3.xml><?xml version="1.0" encoding="utf-8"?>
+<w:hdr xmlns:wpc="http://schemas.microsoft.com/office/word/2010/wordprocessingCanvas" xmlns:cx="http://schemas.microsoft.com/office/drawing/2014/chartex" xmlns:cx1="http://schemas.microsoft.com/office/drawing/2015/9/8/chartex" xmlns:cx2="http://schemas.microsoft.com/office/drawing/2015/10/21/chartex" xmlns:cx3="http://schemas.microsoft.com/office/drawing/2016/5/9/chartex" xmlns:cx4="http://schemas.microsoft.com/office/drawing/2016/5/10/chartex" xmlns:cx5="http://schemas.microsoft.com/office/drawing/2016/5/11/chartex" xmlns:cx6="http://schemas.microsoft.com/office/drawing/2016/5/12/chartex" xmlns:cx7="http://schemas.microsoft.com/office/drawing/2016/5/13/chartex" xmlns:cx8="http://schemas.microsoft.com/office/drawing/2016/5/14/chartex" xmlns:mc="http://schemas.openxmlformats.org/markup-compatibility/2006" xmlns:aink="http://schemas.microsoft.com/office/drawing/2016/ink" xmlns:am3d="http://schemas.microsoft.com/office/drawing/2017/model3d" xmlns:o="urn:schemas-microsoft-com:office:office" xmlns:r="http://schemas.openxmlformats.org/officeDocument/2006/relationships" xmlns:m="http://schemas.openxmlformats.org/officeDocument/2006/math" xmlns:v="urn:schemas-microsoft-com:vml" xmlns:wp14="http://schemas.microsoft.com/office/word/2010/wordprocessingDrawing" xmlns:wp="http://schemas.openxmlformats.org/drawingml/2006/wordprocessingDrawing" xmlns:w10="urn:schemas-microsoft-com:office:word" xmlns:w="http://schemas.openxmlformats.org/wordprocessingml/2006/main" xmlns:w14="http://schemas.microsoft.com/office/word/2010/wordml" xmlns:w15="http://schemas.microsoft.com/office/word/2012/wordml" xmlns:w16cex="http://schemas.microsoft.com/office/word/2018/wordml/cex" xmlns:w16cid="http://schemas.microsoft.com/office/word/2016/wordml/cid" xmlns:w16="http://schemas.microsoft.com/office/word/2018/wordml" xmlns:w16sdtdh="http://schemas.microsoft.com/office/word/2020/wordml/sdtdatahash" xmlns:w16se="http://schemas.microsoft.com/office/word/2015/wordml/symex" xmlns:wpg="http://schemas.microsoft.com/office/word/2010/wordprocessingGroup" xmlns:wpi="http://schemas.microsoft.com/office/word/2010/wordprocessingInk" xmlns:wne="http://schemas.microsoft.com/office/word/2006/wordml" xmlns:wps="http://schemas.microsoft.com/office/word/2010/wordprocessingShape" mc:Ignorable="w14 w15 w16se w16cid w16 w16cex w16sdtdh wp14">
+  <w:p>
+    <w:pPr>
+      <w:pStyle w:val="Header"/>
+    </w:pPr>
+  </w:p>
+</w:hdr>
 </file>
 
 <file path=word/numbering.xml><?xml version="1.0" encoding="utf-8"?>
@@ -4994,6 +4602,50 @@
       </w:tcPr>
     </w:tblStylePr>
   </w:style>
+  <w:style w:type="paragraph" w:styleId="Header">
+    <w:name w:val="header"/>
+    <w:basedOn w:val="Normal"/>
+    <w:link w:val="HeaderChar"/>
+    <w:uiPriority w:val="99"/>
+    <w:unhideWhenUsed/>
+    <w:rsid w:val="00243A66"/>
+    <w:pPr>
+      <w:tabs>
+        <w:tab w:val="center" w:pos="4513"/>
+        <w:tab w:val="right" w:pos="9026"/>
+      </w:tabs>
+      <w:spacing w:after="0" w:line="240" w:lineRule="auto"/>
+    </w:pPr>
+  </w:style>
+  <w:style w:type="character" w:customStyle="1" w:styleId="HeaderChar">
+    <w:name w:val="Header Char"/>
+    <w:basedOn w:val="DefaultParagraphFont"/>
+    <w:link w:val="Header"/>
+    <w:uiPriority w:val="99"/>
+    <w:rsid w:val="00243A66"/>
+  </w:style>
+  <w:style w:type="paragraph" w:styleId="Footer">
+    <w:name w:val="footer"/>
+    <w:basedOn w:val="Normal"/>
+    <w:link w:val="FooterChar"/>
+    <w:uiPriority w:val="99"/>
+    <w:unhideWhenUsed/>
+    <w:rsid w:val="00243A66"/>
+    <w:pPr>
+      <w:tabs>
+        <w:tab w:val="center" w:pos="4513"/>
+        <w:tab w:val="right" w:pos="9026"/>
+      </w:tabs>
+      <w:spacing w:after="0" w:line="240" w:lineRule="auto"/>
+    </w:pPr>
+  </w:style>
+  <w:style w:type="character" w:customStyle="1" w:styleId="FooterChar">
+    <w:name w:val="Footer Char"/>
+    <w:basedOn w:val="DefaultParagraphFont"/>
+    <w:link w:val="Footer"/>
+    <w:uiPriority w:val="99"/>
+    <w:rsid w:val="00243A66"/>
+  </w:style>
 </w:styles>
 </file>
 

</xml_diff>